<commit_message>
Fix favicon: transparent, M black, Y gold
</commit_message>
<xml_diff>
--- a/muhammad-yaseen-ai-engineer-resume.docx
+++ b/muhammad-yaseen-ai-engineer-resume.docx
@@ -34,23 +34,76 @@
     </w:p>
     <w:p>
       <w:pPr>
-        <w:spacing w:after="60"/>
+        <w:spacing w:line="240" w:lineRule="auto"/>
         <w:jc w:val="center"/>
-      </w:pPr>
-      <w:r>
-        <w:rPr>
-          <w:color w:val="666666"/>
-          <w:sz w:val="20"/>
-          <w:szCs w:val="20"/>
-        </w:rPr>
-        <w:t xml:space="preserve">Islamabad, Pakistan | </w:t>
-      </w:r>
-      <w:r>
         <w:rPr>
           <w:color w:val="1A5276"/>
           <w:sz w:val="20"/>
           <w:szCs w:val="20"/>
         </w:rPr>
+      </w:pPr>
+      <w:r>
+        <w:rPr>
+          <w:color w:val="666666"/>
+          <w:sz w:val="20"/>
+          <w:szCs w:val="20"/>
+        </w:rPr>
+        <w:t>Islamabad, Pakistan</w:t>
+      </w:r>
+      <w:r>
+        <w:rPr>
+          <w:color w:val="666666"/>
+          <w:sz w:val="20"/>
+          <w:szCs w:val="20"/>
+        </w:rPr>
+        <w:t xml:space="preserve">  </w:t>
+      </w:r>
+      <w:r>
+        <w:rPr>
+          <w:color w:val="666666"/>
+          <w:sz w:val="20"/>
+          <w:szCs w:val="20"/>
+        </w:rPr>
+        <w:t xml:space="preserve">   </w:t>
+      </w:r>
+      <w:r>
+        <w:rPr>
+          <w:color w:val="666666"/>
+          <w:sz w:val="20"/>
+          <w:szCs w:val="20"/>
+        </w:rPr>
+        <w:t xml:space="preserve"> |</w:t>
+      </w:r>
+      <w:r>
+        <w:rPr>
+          <w:color w:val="666666"/>
+          <w:sz w:val="20"/>
+          <w:szCs w:val="20"/>
+        </w:rPr>
+        <w:t xml:space="preserve">  </w:t>
+      </w:r>
+      <w:r>
+        <w:rPr>
+          <w:color w:val="666666"/>
+          <w:sz w:val="20"/>
+          <w:szCs w:val="20"/>
+        </w:rPr>
+        <w:t xml:space="preserve">   </w:t>
+      </w:r>
+      <w:r>
+        <w:rPr>
+          <w:color w:val="666666"/>
+          <w:sz w:val="20"/>
+          <w:szCs w:val="20"/>
+        </w:rPr>
+        <w:t xml:space="preserve"> </w:t>
+      </w:r>
+      <w:r>
+        <w:rPr>
+          <w:color w:val="1A5276"/>
+          <w:sz w:val="20"/>
+          <w:szCs w:val="20"/>
+        </w:rPr>
         <w:t>yaseenaidev@gmail.com</w:t>
       </w:r>
       <w:r>
@@ -59,7 +112,55 @@
           <w:sz w:val="20"/>
           <w:szCs w:val="20"/>
         </w:rPr>
-        <w:t xml:space="preserve"> | </w:t>
+        <w:t xml:space="preserve"> </w:t>
+      </w:r>
+      <w:r>
+        <w:rPr>
+          <w:color w:val="999999"/>
+          <w:sz w:val="20"/>
+          <w:szCs w:val="20"/>
+        </w:rPr>
+        <w:t xml:space="preserve">   </w:t>
+      </w:r>
+      <w:r>
+        <w:rPr>
+          <w:color w:val="999999"/>
+          <w:sz w:val="20"/>
+          <w:szCs w:val="20"/>
+        </w:rPr>
+        <w:t xml:space="preserve">  </w:t>
+      </w:r>
+      <w:r>
+        <w:rPr>
+          <w:color w:val="999999"/>
+          <w:sz w:val="20"/>
+          <w:szCs w:val="20"/>
+        </w:rPr>
+        <w:t>|</w:t>
+      </w:r>
+      <w:r>
+        <w:rPr>
+          <w:color w:val="999999"/>
+          <w:sz w:val="20"/>
+          <w:szCs w:val="20"/>
+        </w:rPr>
+        <w:t xml:space="preserve">  </w:t>
+      </w:r>
+      <w:r>
+        <w:rPr>
+          <w:color w:val="999999"/>
+          <w:sz w:val="20"/>
+          <w:szCs w:val="20"/>
+        </w:rPr>
+        <w:t xml:space="preserve">   </w:t>
+      </w:r>
+      <w:r>
+        <w:rPr>
+          <w:color w:val="999999"/>
+          <w:sz w:val="20"/>
+          <w:szCs w:val="20"/>
+        </w:rPr>
+        <w:t xml:space="preserve"> </w:t>
       </w:r>
       <w:r>
         <w:rPr>
@@ -67,6 +168,20 @@
           <w:sz w:val="20"/>
           <w:szCs w:val="20"/>
         </w:rPr>
+        <w:t>+92 3029770128</w:t>
+      </w:r>
+    </w:p>
+    <w:p>
+      <w:pPr>
+        <w:spacing w:line="240" w:lineRule="auto"/>
+        <w:jc w:val="center"/>
+      </w:pPr>
+      <w:r>
+        <w:rPr>
+          <w:color w:val="1A5276"/>
+          <w:sz w:val="20"/>
+          <w:szCs w:val="20"/>
+        </w:rPr>
         <w:t>github.com/</w:t>
       </w:r>
       <w:proofErr w:type="spellStart"/>
@@ -85,7 +200,55 @@
           <w:sz w:val="20"/>
           <w:szCs w:val="20"/>
         </w:rPr>
-        <w:t xml:space="preserve"> | </w:t>
+        <w:t xml:space="preserve"> </w:t>
+      </w:r>
+      <w:r>
+        <w:rPr>
+          <w:color w:val="999999"/>
+          <w:sz w:val="20"/>
+          <w:szCs w:val="20"/>
+        </w:rPr>
+        <w:t xml:space="preserve">   </w:t>
+      </w:r>
+      <w:r>
+        <w:rPr>
+          <w:color w:val="999999"/>
+          <w:sz w:val="20"/>
+          <w:szCs w:val="20"/>
+        </w:rPr>
+        <w:t xml:space="preserve">  </w:t>
+      </w:r>
+      <w:r>
+        <w:rPr>
+          <w:color w:val="999999"/>
+          <w:sz w:val="20"/>
+          <w:szCs w:val="20"/>
+        </w:rPr>
+        <w:t>|</w:t>
+      </w:r>
+      <w:r>
+        <w:rPr>
+          <w:color w:val="999999"/>
+          <w:sz w:val="20"/>
+          <w:szCs w:val="20"/>
+        </w:rPr>
+        <w:t xml:space="preserve">  </w:t>
+      </w:r>
+      <w:r>
+        <w:rPr>
+          <w:color w:val="999999"/>
+          <w:sz w:val="20"/>
+          <w:szCs w:val="20"/>
+        </w:rPr>
+        <w:t xml:space="preserve">   </w:t>
+      </w:r>
+      <w:r>
+        <w:rPr>
+          <w:color w:val="999999"/>
+          <w:sz w:val="20"/>
+          <w:szCs w:val="20"/>
+        </w:rPr>
+        <w:t xml:space="preserve"> </w:t>
       </w:r>
       <w:r>
         <w:rPr>
@@ -637,6 +800,7 @@
         <w:rPr>
           <w:color w:val="333333"/>
         </w:rPr>
+        <w:lastRenderedPageBreak/>
         <w:t>Integrated LLM-powered conversational agents into customer-facing support systems, reducing ticket resolution time by 58% through intelligent triage and contextual response generation.</w:t>
       </w:r>
     </w:p>
@@ -655,7 +819,6 @@
           <w:sz w:val="24"/>
           <w:szCs w:val="24"/>
         </w:rPr>
-        <w:lastRenderedPageBreak/>
         <w:t>AI Engineer</w:t>
       </w:r>
       <w:r>
@@ -1111,6 +1274,11 @@
     <w:p>
       <w:pPr>
         <w:spacing w:before="10" w:after="40"/>
+        <w:rPr>
+          <w:color w:val="666666"/>
+          <w:sz w:val="20"/>
+          <w:szCs w:val="20"/>
+        </w:rPr>
       </w:pPr>
       <w:r>
         <w:rPr>
@@ -1166,6 +1334,16 @@
         </w:rPr>
         <w:t>, Twilio, Redis</w:t>
       </w:r>
+    </w:p>
+    <w:p>
+      <w:pPr>
+        <w:spacing w:before="10" w:after="40"/>
+        <w:rPr>
+          <w:color w:val="666666"/>
+          <w:sz w:val="20"/>
+          <w:szCs w:val="20"/>
+        </w:rPr>
+      </w:pPr>
     </w:p>
     <w:p>
       <w:pPr>
@@ -1179,6 +1357,7 @@
           <w:sz w:val="23"/>
           <w:szCs w:val="23"/>
         </w:rPr>
+        <w:lastRenderedPageBreak/>
         <w:t>Smart Cities AI Monitoring Platform</w:t>
       </w:r>
     </w:p>
@@ -1209,7 +1388,6 @@
           <w:sz w:val="20"/>
           <w:szCs w:val="20"/>
         </w:rPr>
-        <w:lastRenderedPageBreak/>
         <w:t xml:space="preserve">Impact: </w:t>
       </w:r>
       <w:r>
@@ -1761,8 +1939,16 @@
           <w:sz w:val="21"/>
           <w:szCs w:val="21"/>
         </w:rPr>
-        <w:t xml:space="preserve"> — Coursera</w:t>
-      </w:r>
+        <w:t xml:space="preserve"> — </w:t>
+      </w:r>
+      <w:hyperlink r:id="rId5" w:history="1">
+        <w:r>
+          <w:rPr>
+            <w:color w:val="777777"/>
+          </w:rPr>
+          <w:t>Coursera</w:t>
+        </w:r>
+      </w:hyperlink>
     </w:p>
     <w:p>
       <w:pPr>
@@ -1802,8 +1988,16 @@
           <w:sz w:val="21"/>
           <w:szCs w:val="21"/>
         </w:rPr>
-        <w:t xml:space="preserve"> — Coursera</w:t>
-      </w:r>
+        <w:t xml:space="preserve"> — </w:t>
+      </w:r>
+      <w:hyperlink r:id="rId6" w:history="1">
+        <w:r>
+          <w:rPr>
+            <w:color w:val="777777"/>
+          </w:rPr>
+          <w:t>Coursera</w:t>
+        </w:r>
+      </w:hyperlink>
     </w:p>
     <w:p>
       <w:pPr>
@@ -1833,8 +2027,16 @@
           <w:sz w:val="21"/>
           <w:szCs w:val="21"/>
         </w:rPr>
-        <w:t xml:space="preserve"> — Coursera</w:t>
-      </w:r>
+        <w:t xml:space="preserve"> — </w:t>
+      </w:r>
+      <w:hyperlink r:id="rId7" w:history="1">
+        <w:r>
+          <w:rPr>
+            <w:color w:val="777777"/>
+          </w:rPr>
+          <w:t>Coursera</w:t>
+        </w:r>
+      </w:hyperlink>
     </w:p>
     <w:p>
       <w:pPr>
@@ -1864,8 +2066,16 @@
           <w:sz w:val="21"/>
           <w:szCs w:val="21"/>
         </w:rPr>
-        <w:t xml:space="preserve"> — Coursera</w:t>
-      </w:r>
+        <w:t xml:space="preserve"> — </w:t>
+      </w:r>
+      <w:hyperlink r:id="rId8" w:history="1">
+        <w:r>
+          <w:rPr>
+            <w:color w:val="777777"/>
+          </w:rPr>
+          <w:t>Coursera</w:t>
+        </w:r>
+      </w:hyperlink>
     </w:p>
     <w:p>
       <w:pPr>
@@ -1895,8 +2105,16 @@
           <w:sz w:val="21"/>
           <w:szCs w:val="21"/>
         </w:rPr>
-        <w:t xml:space="preserve"> — Coursera</w:t>
-      </w:r>
+        <w:t xml:space="preserve"> — </w:t>
+      </w:r>
+      <w:hyperlink r:id="rId9" w:history="1">
+        <w:r>
+          <w:rPr>
+            <w:color w:val="777777"/>
+          </w:rPr>
+          <w:t>Coursera</w:t>
+        </w:r>
+      </w:hyperlink>
     </w:p>
     <w:p>
       <w:pPr>
@@ -2155,15 +2373,6 @@
   </w:num>
   <w:num w:numId="2" w16cid:durableId="226964984">
     <w:abstractNumId w:val="1"/>
-    <w:lvlOverride w:ilvl="0"/>
-    <w:lvlOverride w:ilvl="1"/>
-    <w:lvlOverride w:ilvl="2"/>
-    <w:lvlOverride w:ilvl="3"/>
-    <w:lvlOverride w:ilvl="4"/>
-    <w:lvlOverride w:ilvl="5"/>
-    <w:lvlOverride w:ilvl="6"/>
-    <w:lvlOverride w:ilvl="7"/>
-    <w:lvlOverride w:ilvl="8"/>
   </w:num>
 </w:numbering>
 </file>
@@ -2776,6 +2985,18 @@
       <w:szCs w:val="20"/>
     </w:rPr>
   </w:style>
+  <w:style w:type="character" w:styleId="UnresolvedMention">
+    <w:name w:val="Unresolved Mention"/>
+    <w:basedOn w:val="DefaultParagraphFont"/>
+    <w:uiPriority w:val="99"/>
+    <w:semiHidden/>
+    <w:unhideWhenUsed/>
+    <w:rsid w:val="00AF49C0"/>
+    <w:rPr>
+      <w:color w:val="605E5C"/>
+      <w:shd w:val="clear" w:color="auto" w:fill="E1DFDD"/>
+    </w:rPr>
+  </w:style>
 </w:styles>
 </file>
 

</xml_diff>